<commit_message>
Simplify report headings and document section comparison
</commit_message>
<xml_diff>
--- a/rapor/revision_20261008/deliverables/CS395_FinalReport_Efe_Han_Keleş_4October2026.docx
+++ b/rapor/revision_20261008/deliverables/CS395_FinalReport_Efe_Han_Keleş_4October2026.docx
@@ -391,6 +391,26 @@
           <w:szCs w:val="24"/>
         </w:rPr>
         <w:t>Abstract</w:t>
+      </w:r>
+    </w:p>
+    <w:p>
+      <w:pPr>
+        <w:pStyle w:val="Normal"/>
+        <w:keepNext/>
+        <w:widowControl/>
+        <w:spacing w:before="0" w:after="0" w:line="480" w:lineRule="auto"/>
+        <w:ind w:left="0" w:right="0" w:firstLine="0"/>
+        <w:jc w:val="both"/>
+      </w:pPr>
+      <w:r>
+        <w:rPr>
+          <w:b/>
+          <w:color w:val="000000"/>
+          <w:rFonts w:ascii="Times New Roman" w:hAnsi="Times New Roman" w:eastAsia="Times New Roman" w:cs="Times New Roman"/>
+          <w:sz w:val="24"/>
+          <w:szCs w:val="24"/>
+        </w:rPr>
+        <w:t>[TO COMPLETE]</w:t>
       </w:r>
     </w:p>
     <w:p>
@@ -925,7 +945,7 @@
               <w:sz w:val="24"/>
               <w:szCs w:val="24"/>
             </w:rPr>
-            <w:t>4.5.1 Early models and the first transfer failures:</w:t>
+            <w:t>4.5.1 First models and early tests</w:t>
           </w:r>
           <w:r>
             <w:rPr>
@@ -961,7 +981,7 @@
               <w:sz w:val="24"/>
               <w:szCs w:val="24"/>
             </w:rPr>
-            <w:t>4.5.2 Data integrity and corrected conclusions</w:t>
+            <w:t>4.5.2 Finding and correcting errors</w:t>
           </w:r>
           <w:r>
             <w:rPr>
@@ -997,7 +1017,7 @@
               <w:sz w:val="24"/>
               <w:szCs w:val="24"/>
             </w:rPr>
-            <w:t>4.5.3 Data roles and processinf conditions</w:t>
+            <w:t>4.5.3 Preparing the images</w:t>
           </w:r>
           <w:r>
             <w:rPr>
@@ -1033,7 +1053,7 @@
               <w:sz w:val="24"/>
               <w:szCs w:val="24"/>
             </w:rPr>
-            <w:t>4.5.4 E92 representations and learning</w:t>
+            <w:t>4.5.4 How E92 works</w:t>
           </w:r>
           <w:r>
             <w:rPr>
@@ -1069,7 +1089,7 @@
               <w:sz w:val="24"/>
               <w:szCs w:val="24"/>
             </w:rPr>
-            <w:t>4.5.5 Development criteria</w:t>
+            <w:t>4.5.5 How we checked model performance</w:t>
           </w:r>
           <w:r>
             <w:rPr>
@@ -1105,7 +1125,7 @@
               <w:sz w:val="24"/>
               <w:szCs w:val="24"/>
             </w:rPr>
-            <w:t>4.5.6 Development improvement and accaptance limits</w:t>
+            <w:t>4.5.6 E92 results and remaining problems</w:t>
           </w:r>
           <w:r>
             <w:rPr>
@@ -1141,7 +1161,7 @@
               <w:sz w:val="24"/>
               <w:szCs w:val="24"/>
             </w:rPr>
-            <w:t>4.5.7 Honest scores and the web demostration</w:t>
+            <w:t>4.5.7 How the web demo makes decisions</w:t>
           </w:r>
           <w:r>
             <w:rPr>
@@ -1177,7 +1197,7 @@
               <w:sz w:val="24"/>
               <w:szCs w:val="24"/>
             </w:rPr>
-            <w:t>4.5.8 broader checks and rejected improvements</w:t>
+            <w:t>4.5.8 Further tests and unsuccessful changes</w:t>
           </w:r>
           <w:r>
             <w:rPr>
@@ -1213,7 +1233,7 @@
               <w:sz w:val="24"/>
               <w:szCs w:val="24"/>
             </w:rPr>
-            <w:t>4.5.9 Model2 Localization and its limits</w:t>
+            <w:t>4.5.9 Detecting edited areas with Model2</w:t>
           </w:r>
           <w:r>
             <w:rPr>
@@ -2866,7 +2886,7 @@
           <w:sz w:val="24"/>
           <w:szCs w:val="24"/>
         </w:rPr>
-        <w:t>4.5.1 Early models and the first transfer failures:</w:t>
+        <w:t>4.5.1 First models and early tests</w:t>
       </w:r>
     </w:p>
     <w:p>
@@ -2941,7 +2961,7 @@
           <w:sz w:val="24"/>
           <w:szCs w:val="24"/>
         </w:rPr>
-        <w:t>4.5.2 Data integrity and corrected conclusions</w:t>
+        <w:t>4.5.2 Finding and correcting errors</w:t>
       </w:r>
     </w:p>
     <w:p>
@@ -3000,7 +3020,7 @@
           <w:sz w:val="24"/>
           <w:szCs w:val="24"/>
         </w:rPr>
-        <w:t>4.5.3 Data roles and processinf conditions</w:t>
+        <w:t>4.5.3 Preparing the images</w:t>
       </w:r>
     </w:p>
     <w:p>
@@ -4006,7 +4026,7 @@
           <w:sz w:val="24"/>
           <w:szCs w:val="24"/>
         </w:rPr>
-        <w:t>4.5.4 E92 representations and learning</w:t>
+        <w:t>4.5.4 How E92 works</w:t>
       </w:r>
     </w:p>
     <w:p>
@@ -4154,7 +4174,7 @@
           <w:sz w:val="24"/>
           <w:szCs w:val="24"/>
         </w:rPr>
-        <w:t>4.5.5 Development criteria</w:t>
+        <w:t>4.5.5 How we checked model performance</w:t>
       </w:r>
     </w:p>
     <w:p>
@@ -5968,7 +5988,7 @@
           <w:sz w:val="24"/>
           <w:szCs w:val="24"/>
         </w:rPr>
-        <w:t>4.5.6 Development improvement and accaptance limits</w:t>
+        <w:t>4.5.6 E92 results and remaining problems</w:t>
       </w:r>
     </w:p>
     <w:p>
@@ -6116,7 +6136,7 @@
           <w:sz w:val="24"/>
           <w:szCs w:val="24"/>
         </w:rPr>
-        <w:t>4.5.7 Honest scores and the web demostration</w:t>
+        <w:t>4.5.7 How the web demo makes decisions</w:t>
       </w:r>
     </w:p>
     <w:p>
@@ -6173,7 +6193,7 @@
           <w:sz w:val="24"/>
           <w:szCs w:val="24"/>
         </w:rPr>
-        <w:t>4.5.8 broader checks and rejected improvements</w:t>
+        <w:t>4.5.8 Further tests and unsuccessful changes</w:t>
       </w:r>
     </w:p>
     <w:p>
@@ -6230,7 +6250,27 @@
           <w:sz w:val="24"/>
           <w:szCs w:val="24"/>
         </w:rPr>
-        <w:t>4.5.9 Model2 Localization and its limits</w:t>
+        <w:t>4.5.9 Detecting edited areas with Model2</w:t>
+      </w:r>
+    </w:p>
+    <w:p>
+      <w:pPr>
+        <w:pStyle w:val="Normal"/>
+        <w:keepNext/>
+        <w:widowControl/>
+        <w:spacing w:before="0" w:after="0" w:line="480" w:lineRule="auto"/>
+        <w:ind w:left="0" w:right="0" w:firstLine="0"/>
+        <w:jc w:val="both"/>
+      </w:pPr>
+      <w:r>
+        <w:rPr>
+          <w:b/>
+          <w:color w:val="000000"/>
+          <w:rFonts w:ascii="Times New Roman" w:hAnsi="Times New Roman" w:eastAsia="Times New Roman" w:cs="Times New Roman"/>
+          <w:sz w:val="24"/>
+          <w:szCs w:val="24"/>
+        </w:rPr>
+        <w:t>[TO COMPLETE]</w:t>
       </w:r>
     </w:p>
     <w:p>

</xml_diff>